<commit_message>
Add upcoming plan to thesis explainer
Co-Authored-By: Claude Opus 5.5 <noreply@anthropic.com>
Claude-Session: https://claude.ai/code/session_01UunSGkA7xxcu1ZJiDN1zG2
</commit_message>
<xml_diff>
--- a/output/卒論の説明.docx
+++ b/output/卒論の説明.docx
@@ -954,6 +954,372 @@
       <w:r>
         <w:t xml:space="preserve">衝突の種類ごとに、どんな乗り越え方が役に立ったのかをまとめます。「全部を受け入れなくてもよい」「受け入れられないものとは距離を取りながら尊重できる」といった、楽しめなかった人にも使える形で、これから留学する人へのヒントを示します。</w:t>
       </w:r>
+    </w:p>
+    <w:p>
+      <w:pPr>
+        <w:keepNext/>
+        <w:spacing w:after="140" w:before="280"/>
+      </w:pPr>
+      <w:r>
+        <w:rPr>
+          <w:sz w:val="28"/>
+          <w:szCs w:val="28"/>
+        </w:rPr>
+        <w:t xml:space="preserve">これからの予定</w:t>
+      </w:r>
+    </w:p>
+    <w:p>
+      <w:pPr>
+        <w:keepNext/>
+        <w:spacing w:after="120" w:line="360"/>
+        <w:ind w:firstLine="210"/>
+      </w:pPr>
+      <w:r>
+        <w:t xml:space="preserve">現在は前半（研究背景から研究方法まで）の原稿ができた段階です。1月の提出に向けて、次の順に進めます。</w:t>
+      </w:r>
+    </w:p>
+    <w:tbl>
+      <w:tblPr>
+        <w:tblW w:type="dxa" w:w="9070"/>
+        <w:tblBorders>
+          <w:top w:val="single" w:color="auto" w:sz="4"/>
+          <w:left w:val="single" w:color="auto" w:sz="4"/>
+          <w:bottom w:val="single" w:color="auto" w:sz="4"/>
+          <w:right w:val="single" w:color="auto" w:sz="4"/>
+          <w:insideH w:val="single" w:color="auto" w:sz="4"/>
+          <w:insideV w:val="single" w:color="auto" w:sz="4"/>
+        </w:tblBorders>
+      </w:tblPr>
+      <w:tblGrid>
+        <w:gridCol w:w="2160"/>
+        <w:gridCol w:w="6910"/>
+      </w:tblGrid>
+      <w:tr>
+        <w:trPr>
+          <w:tblHeader/>
+        </w:trPr>
+        <w:tc>
+          <w:tcPr>
+            <w:tcW w:type="dxa" w:w="2160"/>
+            <w:tcBorders>
+              <w:top w:val="single" w:color="999999" w:sz="4"/>
+              <w:left w:val="single" w:color="999999" w:sz="4"/>
+              <w:bottom w:val="single" w:color="999999" w:sz="4"/>
+              <w:right w:val="single" w:color="999999" w:sz="4"/>
+            </w:tcBorders>
+            <w:shd w:fill="EDEDED" w:color="auto" w:val="clear"/>
+            <w:tcMar>
+              <w:top w:type="dxa" w:w="60"/>
+              <w:left w:type="dxa" w:w="100"/>
+              <w:bottom w:type="dxa" w:w="60"/>
+              <w:right w:type="dxa" w:w="100"/>
+            </w:tcMar>
+          </w:tcPr>
+          <w:p>
+            <w:pPr>
+              <w:spacing w:line="280"/>
+            </w:pPr>
+            <w:r>
+              <w:rPr>
+                <w:b/>
+                <w:bCs/>
+                <w:sz w:val="19"/>
+                <w:szCs w:val="19"/>
+              </w:rPr>
+              <w:t xml:space="preserve">時期</w:t>
+            </w:r>
+          </w:p>
+        </w:tc>
+        <w:tc>
+          <w:tcPr>
+            <w:tcW w:type="dxa" w:w="6910"/>
+            <w:tcBorders>
+              <w:top w:val="single" w:color="999999" w:sz="4"/>
+              <w:left w:val="single" w:color="999999" w:sz="4"/>
+              <w:bottom w:val="single" w:color="999999" w:sz="4"/>
+              <w:right w:val="single" w:color="999999" w:sz="4"/>
+            </w:tcBorders>
+            <w:shd w:fill="EDEDED" w:color="auto" w:val="clear"/>
+            <w:tcMar>
+              <w:top w:type="dxa" w:w="60"/>
+              <w:left w:type="dxa" w:w="100"/>
+              <w:bottom w:type="dxa" w:w="60"/>
+              <w:right w:type="dxa" w:w="100"/>
+            </w:tcMar>
+          </w:tcPr>
+          <w:p>
+            <w:pPr>
+              <w:spacing w:line="280"/>
+            </w:pPr>
+            <w:r>
+              <w:rPr>
+                <w:b/>
+                <w:bCs/>
+                <w:sz w:val="19"/>
+                <w:szCs w:val="19"/>
+              </w:rPr>
+              <w:t xml:space="preserve">やること</w:t>
+            </w:r>
+          </w:p>
+        </w:tc>
+      </w:tr>
+      <w:tr>
+        <w:trPr>
+          <w:cantSplit/>
+        </w:trPr>
+        <w:tc>
+          <w:tcPr>
+            <w:tcW w:type="dxa" w:w="2160"/>
+            <w:tcBorders>
+              <w:top w:val="single" w:color="999999" w:sz="4"/>
+              <w:left w:val="single" w:color="999999" w:sz="4"/>
+              <w:bottom w:val="single" w:color="999999" w:sz="4"/>
+              <w:right w:val="single" w:color="999999" w:sz="4"/>
+            </w:tcBorders>
+            <w:tcMar>
+              <w:top w:type="dxa" w:w="60"/>
+              <w:left w:type="dxa" w:w="100"/>
+              <w:bottom w:type="dxa" w:w="60"/>
+              <w:right w:type="dxa" w:w="100"/>
+            </w:tcMar>
+          </w:tcPr>
+          <w:p>
+            <w:pPr>
+              <w:spacing w:line="280"/>
+            </w:pPr>
+            <w:r>
+              <w:rPr>
+                <w:sz w:val="19"/>
+                <w:szCs w:val="19"/>
+              </w:rPr>
+              <w:t xml:space="preserve">10月</w:t>
+            </w:r>
+          </w:p>
+        </w:tc>
+        <w:tc>
+          <w:tcPr>
+            <w:tcW w:type="dxa" w:w="6910"/>
+            <w:tcBorders>
+              <w:top w:val="single" w:color="999999" w:sz="4"/>
+              <w:left w:val="single" w:color="999999" w:sz="4"/>
+              <w:bottom w:val="single" w:color="999999" w:sz="4"/>
+              <w:right w:val="single" w:color="999999" w:sz="4"/>
+            </w:tcBorders>
+            <w:tcMar>
+              <w:top w:type="dxa" w:w="60"/>
+              <w:left w:type="dxa" w:w="100"/>
+              <w:bottom w:type="dxa" w:w="60"/>
+              <w:right w:type="dxa" w:w="100"/>
+            </w:tcMar>
+          </w:tcPr>
+          <w:p>
+            <w:pPr>
+              <w:spacing w:line="280"/>
+            </w:pPr>
+            <w:r>
+              <w:rPr>
+                <w:sz w:val="19"/>
+                <w:szCs w:val="19"/>
+              </w:rPr>
+              <w:t xml:space="preserve">先生と研究方法・アンケートの人数を決める。参考文献の確認と、自分の経験（特にベトナム）の書き足し</w:t>
+            </w:r>
+          </w:p>
+        </w:tc>
+      </w:tr>
+      <w:tr>
+        <w:trPr>
+          <w:cantSplit/>
+        </w:trPr>
+        <w:tc>
+          <w:tcPr>
+            <w:tcW w:type="dxa" w:w="2160"/>
+            <w:tcBorders>
+              <w:top w:val="single" w:color="999999" w:sz="4"/>
+              <w:left w:val="single" w:color="999999" w:sz="4"/>
+              <w:bottom w:val="single" w:color="999999" w:sz="4"/>
+              <w:right w:val="single" w:color="999999" w:sz="4"/>
+            </w:tcBorders>
+            <w:tcMar>
+              <w:top w:type="dxa" w:w="60"/>
+              <w:left w:type="dxa" w:w="100"/>
+              <w:bottom w:type="dxa" w:w="60"/>
+              <w:right w:type="dxa" w:w="100"/>
+            </w:tcMar>
+          </w:tcPr>
+          <w:p>
+            <w:pPr>
+              <w:spacing w:line="280"/>
+            </w:pPr>
+            <w:r>
+              <w:rPr>
+                <w:sz w:val="19"/>
+                <w:szCs w:val="19"/>
+              </w:rPr>
+              <w:t xml:space="preserve">10月後半〜11月</w:t>
+            </w:r>
+          </w:p>
+        </w:tc>
+        <w:tc>
+          <w:tcPr>
+            <w:tcW w:type="dxa" w:w="6910"/>
+            <w:tcBorders>
+              <w:top w:val="single" w:color="999999" w:sz="4"/>
+              <w:left w:val="single" w:color="999999" w:sz="4"/>
+              <w:bottom w:val="single" w:color="999999" w:sz="4"/>
+              <w:right w:val="single" w:color="999999" w:sz="4"/>
+            </w:tcBorders>
+            <w:tcMar>
+              <w:top w:type="dxa" w:w="60"/>
+              <w:left w:type="dxa" w:w="100"/>
+              <w:bottom w:type="dxa" w:w="60"/>
+              <w:right w:type="dxa" w:w="100"/>
+            </w:tcMar>
+          </w:tcPr>
+          <w:p>
+            <w:pPr>
+              <w:spacing w:line="280"/>
+            </w:pPr>
+            <w:r>
+              <w:rPr>
+                <w:sz w:val="19"/>
+                <w:szCs w:val="19"/>
+              </w:rPr>
+              <w:t xml:space="preserve">アンケートを作って留学経験者に配り、必要な人に追加インタビューをする</w:t>
+            </w:r>
+          </w:p>
+        </w:tc>
+      </w:tr>
+      <w:tr>
+        <w:trPr>
+          <w:cantSplit/>
+        </w:trPr>
+        <w:tc>
+          <w:tcPr>
+            <w:tcW w:type="dxa" w:w="2160"/>
+            <w:tcBorders>
+              <w:top w:val="single" w:color="999999" w:sz="4"/>
+              <w:left w:val="single" w:color="999999" w:sz="4"/>
+              <w:bottom w:val="single" w:color="999999" w:sz="4"/>
+              <w:right w:val="single" w:color="999999" w:sz="4"/>
+            </w:tcBorders>
+            <w:tcMar>
+              <w:top w:type="dxa" w:w="60"/>
+              <w:left w:type="dxa" w:w="100"/>
+              <w:bottom w:type="dxa" w:w="60"/>
+              <w:right w:type="dxa" w:w="100"/>
+            </w:tcMar>
+          </w:tcPr>
+          <w:p>
+            <w:pPr>
+              <w:spacing w:line="280"/>
+            </w:pPr>
+            <w:r>
+              <w:rPr>
+                <w:sz w:val="19"/>
+                <w:szCs w:val="19"/>
+              </w:rPr>
+              <w:t xml:space="preserve">11月〜12月</w:t>
+            </w:r>
+          </w:p>
+        </w:tc>
+        <w:tc>
+          <w:tcPr>
+            <w:tcW w:type="dxa" w:w="6910"/>
+            <w:tcBorders>
+              <w:top w:val="single" w:color="999999" w:sz="4"/>
+              <w:left w:val="single" w:color="999999" w:sz="4"/>
+              <w:bottom w:val="single" w:color="999999" w:sz="4"/>
+              <w:right w:val="single" w:color="999999" w:sz="4"/>
+            </w:tcBorders>
+            <w:tcMar>
+              <w:top w:type="dxa" w:w="60"/>
+              <w:left w:type="dxa" w:w="100"/>
+              <w:bottom w:type="dxa" w:w="60"/>
+              <w:right w:type="dxa" w:w="100"/>
+            </w:tcMar>
+          </w:tcPr>
+          <w:p>
+            <w:pPr>
+              <w:spacing w:line="280"/>
+            </w:pPr>
+            <w:r>
+              <w:rPr>
+                <w:sz w:val="19"/>
+                <w:szCs w:val="19"/>
+              </w:rPr>
+              <w:t xml:space="preserve">回答を衝突の種類ごとに整理・分析し、結果・考察・結論を書く</w:t>
+            </w:r>
+          </w:p>
+        </w:tc>
+      </w:tr>
+      <w:tr>
+        <w:trPr>
+          <w:cantSplit/>
+        </w:trPr>
+        <w:tc>
+          <w:tcPr>
+            <w:tcW w:type="dxa" w:w="2160"/>
+            <w:tcBorders>
+              <w:top w:val="single" w:color="999999" w:sz="4"/>
+              <w:left w:val="single" w:color="999999" w:sz="4"/>
+              <w:bottom w:val="single" w:color="999999" w:sz="4"/>
+              <w:right w:val="single" w:color="999999" w:sz="4"/>
+            </w:tcBorders>
+            <w:tcMar>
+              <w:top w:type="dxa" w:w="60"/>
+              <w:left w:type="dxa" w:w="100"/>
+              <w:bottom w:type="dxa" w:w="60"/>
+              <w:right w:type="dxa" w:w="100"/>
+            </w:tcMar>
+          </w:tcPr>
+          <w:p>
+            <w:pPr>
+              <w:spacing w:line="280"/>
+            </w:pPr>
+            <w:r>
+              <w:rPr>
+                <w:sz w:val="19"/>
+                <w:szCs w:val="19"/>
+              </w:rPr>
+              <w:t xml:space="preserve">1月上旬</w:t>
+            </w:r>
+          </w:p>
+        </w:tc>
+        <w:tc>
+          <w:tcPr>
+            <w:tcW w:type="dxa" w:w="6910"/>
+            <w:tcBorders>
+              <w:top w:val="single" w:color="999999" w:sz="4"/>
+              <w:left w:val="single" w:color="999999" w:sz="4"/>
+              <w:bottom w:val="single" w:color="999999" w:sz="4"/>
+              <w:right w:val="single" w:color="999999" w:sz="4"/>
+            </w:tcBorders>
+            <w:tcMar>
+              <w:top w:type="dxa" w:w="60"/>
+              <w:left w:type="dxa" w:w="100"/>
+              <w:bottom w:type="dxa" w:w="60"/>
+              <w:right w:type="dxa" w:w="100"/>
+            </w:tcMar>
+          </w:tcPr>
+          <w:p>
+            <w:pPr>
+              <w:spacing w:line="280"/>
+            </w:pPr>
+            <w:r>
+              <w:rPr>
+                <w:sz w:val="19"/>
+                <w:szCs w:val="19"/>
+              </w:rPr>
+              <w:t xml:space="preserve">要旨を書き、全体を見直して提出する</w:t>
+            </w:r>
+          </w:p>
+        </w:tc>
+      </w:tr>
+    </w:tbl>
+    <w:p>
+      <w:pPr>
+        <w:spacing w:after="120"/>
+      </w:pPr>
     </w:p>
     <w:sectPr>
       <w:footerReference w:type="default" r:id="rId7"/>

</xml_diff>

<commit_message>
Move submission to December in explainer
Co-Authored-By: Claude Opus 5.5 <noreply@anthropic.com>
Claude-Session: https://claude.ai/code/session_01UunSGkA7xxcu1ZJiDN1zG2
</commit_message>
<xml_diff>
--- a/output/卒論の説明.docx
+++ b/output/卒論の説明.docx
@@ -975,7 +975,7 @@
         <w:ind w:firstLine="210"/>
       </w:pPr>
       <w:r>
-        <w:t xml:space="preserve">現在は前半（研究背景から研究方法まで）の原稿ができた段階です。1月の提出に向けて、次の順に進めます。</w:t>
+        <w:t xml:space="preserve">現在は前半（研究背景から研究方法まで）の原稿ができた段階です。12月の提出に向けて、次の順に進めます。</w:t>
       </w:r>
     </w:p>
     <w:tbl>
@@ -1092,7 +1092,7 @@
                 <w:sz w:val="19"/>
                 <w:szCs w:val="19"/>
               </w:rPr>
-              <w:t xml:space="preserve">10月</w:t>
+              <w:t xml:space="preserve">10月前半</w:t>
             </w:r>
           </w:p>
         </w:tc>
@@ -1155,7 +1155,7 @@
                 <w:sz w:val="19"/>
                 <w:szCs w:val="19"/>
               </w:rPr>
-              <w:t xml:space="preserve">10月後半〜11月</w:t>
+              <w:t xml:space="preserve">10月後半</w:t>
             </w:r>
           </w:p>
         </w:tc>
@@ -1218,7 +1218,7 @@
                 <w:sz w:val="19"/>
                 <w:szCs w:val="19"/>
               </w:rPr>
-              <w:t xml:space="preserve">11月〜12月</w:t>
+              <w:t xml:space="preserve">11月</w:t>
             </w:r>
           </w:p>
         </w:tc>
@@ -1281,7 +1281,7 @@
                 <w:sz w:val="19"/>
                 <w:szCs w:val="19"/>
               </w:rPr>
-              <w:t xml:space="preserve">1月上旬</w:t>
+              <w:t xml:space="preserve">12月</w:t>
             </w:r>
           </w:p>
         </w:tc>

</xml_diff>